<commit_message>
docs(arch): add usability & simplicity as first-class goals to onboarding package
Adds a business-friendly UX section: technical-concept -> what-the-admin-sees translation
(RLS -> 'who can see what' preview; reports_to -> visual org chart; permission keys ->
plain-language capability groups; UoM factors -> guided '1 carton = N units' forms);
per-builder visual/drag-drop design; cross-cutting principles (template-first, progressive
disclosure, inline guidance, forgiving, business-term confirmations); a 'never shown'
jargon list; and usability acceptance criteria (non-technical admin completes setup
unaided, no docs/SQL/dev). Design only.

Co-Authored-By: Claude Opus 4.8 (1M context) <noreply@anthropic.com>
Claude-Session: https://claude.ai/code/session_01AnB42F2fTvBjmAfvzDNk4V
</commit_message>
<xml_diff>
--- a/docs/audits/Company-Onboarding-Hierarchy-Platform-Design-2026.docx
+++ b/docs/audits/Company-Onboarding-Hierarchy-Platform-Design-2026.docx
@@ -3741,6 +3741,870 @@
         <w:rPr>
           <w:color w:val="1F497D"/>
         </w:rPr>
+        <w:t>8. Usability &amp; simplicity — FIRST-CLASS design goals</w:t>
+      </w:r>
+    </w:p>
+    <w:p>
+      <w:r>
+        <w:rPr>
+          <w:b/>
+        </w:rPr>
+        <w:t>North star:</w:t>
+      </w:r>
+      <w:r>
+        <w:t xml:space="preserve"> a </w:t>
+      </w:r>
+      <w:r>
+        <w:rPr>
+          <w:b/>
+        </w:rPr>
+        <w:t>non-technical</w:t>
+      </w:r>
+      <w:r>
+        <w:t xml:space="preserve"> Company Admin configures an entire company from the</w:t>
+      </w:r>
+    </w:p>
+    <w:p>
+      <w:r>
+        <w:t xml:space="preserve">UI </w:t>
+      </w:r>
+      <w:r>
+        <w:rPr>
+          <w:b/>
+        </w:rPr>
+        <w:t>without documentation, SQL, or developer support</w:t>
+      </w:r>
+      <w:r>
+        <w:t>. Every technical concept is</w:t>
+      </w:r>
+    </w:p>
+    <w:p>
+      <w:r>
+        <w:t xml:space="preserve">hidden behind a </w:t>
+      </w:r>
+      <w:r>
+        <w:rPr>
+          <w:b/>
+        </w:rPr>
+        <w:t>wizard-driven, visual</w:t>
+      </w:r>
+      <w:r>
+        <w:t xml:space="preserve"> experience that uses </w:t>
+      </w:r>
+      <w:r>
+        <w:rPr>
+          <w:b/>
+        </w:rPr>
+        <w:t>business language only</w:t>
+      </w:r>
+      <w:r>
+        <w:t>.</w:t>
+      </w:r>
+    </w:p>
+    <w:p>
+      <w:pPr>
+        <w:pStyle w:val="Heading3"/>
+      </w:pPr>
+      <w:r>
+        <w:t>Technical concept → what the admin actually sees (never the jargon)</w:t>
+      </w:r>
+    </w:p>
+    <w:tbl>
+      <w:tblPr>
+        <w:tblStyle w:val="LightGrid-Accent1"/>
+        <w:tblW w:type="auto" w:w="0"/>
+        <w:jc w:val="center"/>
+        <w:tblLook w:firstColumn="1" w:firstRow="1" w:lastColumn="0" w:lastRow="0" w:noHBand="0" w:noVBand="1" w:val="04A0"/>
+      </w:tblPr>
+      <w:tblGrid>
+        <w:gridCol w:w="4320"/>
+        <w:gridCol w:w="4320"/>
+      </w:tblGrid>
+      <w:tr>
+        <w:tc>
+          <w:tcPr>
+            <w:tcW w:type="dxa" w:w="4320"/>
+            <w:shd w:val="clear" w:fill="1F497D"/>
+          </w:tcPr>
+          <w:p>
+            <w:r>
+              <w:rPr>
+                <w:b/>
+                <w:color w:val="FFFFFF"/>
+              </w:rPr>
+              <w:t>Under the hood (hidden)</w:t>
+            </w:r>
+          </w:p>
+        </w:tc>
+        <w:tc>
+          <w:tcPr>
+            <w:tcW w:type="dxa" w:w="4320"/>
+            <w:shd w:val="clear" w:fill="1F497D"/>
+          </w:tcPr>
+          <w:p>
+            <w:r>
+              <w:rPr>
+                <w:b/>
+                <w:color w:val="FFFFFF"/>
+              </w:rPr>
+              <w:t>What the Company Admin sees</w:t>
+            </w:r>
+          </w:p>
+        </w:tc>
+      </w:tr>
+      <w:tr>
+        <w:tc>
+          <w:tcPr>
+            <w:tcW w:type="dxa" w:w="4320"/>
+          </w:tcPr>
+          <w:p>
+            <w:r>
+              <w:t>RLS / data scoping</w:t>
+            </w:r>
+          </w:p>
+        </w:tc>
+        <w:tc>
+          <w:tcPr>
+            <w:tcW w:type="dxa" w:w="4320"/>
+          </w:tcPr>
+          <w:p>
+            <w:r>
+              <w:t xml:space="preserve">A </w:t>
+            </w:r>
+            <w:r>
+              <w:rPr>
+                <w:b/>
+              </w:rPr>
+              <w:t>"Who can see what"</w:t>
+            </w:r>
+            <w:r>
+              <w:t xml:space="preserve"> preview ("Hany sees his team's customers") — no policy language</w:t>
+            </w:r>
+          </w:p>
+        </w:tc>
+      </w:tr>
+      <w:tr>
+        <w:tc>
+          <w:tcPr>
+            <w:tcW w:type="dxa" w:w="4320"/>
+          </w:tcPr>
+          <w:p>
+            <w:r>
+              <w:rPr>
+                <w:rFonts w:ascii="Consolas" w:hAnsi="Consolas"/>
+                <w:sz w:val="19"/>
+              </w:rPr>
+              <w:t>reports_to</w:t>
+            </w:r>
+            <w:r>
+              <w:t xml:space="preserve"> tree</w:t>
+            </w:r>
+          </w:p>
+        </w:tc>
+        <w:tc>
+          <w:tcPr>
+            <w:tcW w:type="dxa" w:w="4320"/>
+          </w:tcPr>
+          <w:p>
+            <w:r>
+              <w:t xml:space="preserve">A </w:t>
+            </w:r>
+            <w:r>
+              <w:rPr>
+                <w:b/>
+              </w:rPr>
+              <w:t>visual org chart</w:t>
+            </w:r>
+            <w:r>
+              <w:t>: drag a person under their manager</w:t>
+            </w:r>
+          </w:p>
+        </w:tc>
+      </w:tr>
+      <w:tr>
+        <w:tc>
+          <w:tcPr>
+            <w:tcW w:type="dxa" w:w="4320"/>
+          </w:tcPr>
+          <w:p>
+            <w:r>
+              <w:rPr>
+                <w:rFonts w:ascii="Consolas" w:hAnsi="Consolas"/>
+                <w:sz w:val="19"/>
+              </w:rPr>
+              <w:t>erp_org_levels</w:t>
+            </w:r>
+            <w:r>
+              <w:t xml:space="preserve"> / nodes / </w:t>
+            </w:r>
+            <w:r>
+              <w:rPr>
+                <w:rFonts w:ascii="Consolas" w:hAnsi="Consolas"/>
+                <w:sz w:val="19"/>
+              </w:rPr>
+              <w:t>parent_node_id</w:t>
+            </w:r>
+          </w:p>
+        </w:tc>
+        <w:tc>
+          <w:tcPr>
+            <w:tcW w:type="dxa" w:w="4320"/>
+          </w:tcPr>
+          <w:p>
+            <w:r>
+              <w:rPr>
+                <w:b/>
+              </w:rPr>
+              <w:t>Named layers</w:t>
+            </w:r>
+            <w:r>
+              <w:t xml:space="preserve"> ("Region", "Branch", "Team") and </w:t>
+            </w:r>
+            <w:r>
+              <w:rPr>
+                <w:b/>
+              </w:rPr>
+              <w:t>boxes you drag</w:t>
+            </w:r>
+          </w:p>
+        </w:tc>
+      </w:tr>
+      <w:tr>
+        <w:tc>
+          <w:tcPr>
+            <w:tcW w:type="dxa" w:w="4320"/>
+          </w:tcPr>
+          <w:p>
+            <w:r>
+              <w:t>Permission keys (</w:t>
+            </w:r>
+            <w:r>
+              <w:rPr>
+                <w:rFonts w:ascii="Consolas" w:hAnsi="Consolas"/>
+                <w:sz w:val="19"/>
+              </w:rPr>
+              <w:t>day.close.settle</w:t>
+            </w:r>
+            <w:r>
+              <w:t>…)</w:t>
+            </w:r>
+          </w:p>
+        </w:tc>
+        <w:tc>
+          <w:tcPr>
+            <w:tcW w:type="dxa" w:w="4320"/>
+          </w:tcPr>
+          <w:p>
+            <w:r>
+              <w:rPr>
+                <w:b/>
+              </w:rPr>
+              <w:t>Plain-language capability groups</w:t>
+            </w:r>
+            <w:r>
+              <w:t xml:space="preserve"> with descriptions ("Settle daily cash") + on/off</w:t>
+            </w:r>
+          </w:p>
+        </w:tc>
+      </w:tr>
+      <w:tr>
+        <w:tc>
+          <w:tcPr>
+            <w:tcW w:type="dxa" w:w="4320"/>
+          </w:tcPr>
+          <w:p>
+            <w:r>
+              <w:rPr>
+                <w:rFonts w:ascii="Consolas" w:hAnsi="Consolas"/>
+                <w:sz w:val="19"/>
+              </w:rPr>
+              <w:t>erp_product_levels</w:t>
+            </w:r>
+            <w:r>
+              <w:t xml:space="preserve"> / nodes</w:t>
+            </w:r>
+          </w:p>
+        </w:tc>
+        <w:tc>
+          <w:tcPr>
+            <w:tcW w:type="dxa" w:w="4320"/>
+          </w:tcPr>
+          <w:p>
+            <w:r>
+              <w:rPr>
+                <w:b/>
+              </w:rPr>
+              <w:t>Add a level</w:t>
+            </w:r>
+            <w:r>
+              <w:t xml:space="preserve">, </w:t>
+            </w:r>
+            <w:r>
+              <w:rPr>
+                <w:b/>
+              </w:rPr>
+              <w:t>drag</w:t>
+            </w:r>
+            <w:r>
+              <w:t xml:space="preserve"> products into folders</w:t>
+            </w:r>
+          </w:p>
+        </w:tc>
+      </w:tr>
+      <w:tr>
+        <w:tc>
+          <w:tcPr>
+            <w:tcW w:type="dxa" w:w="4320"/>
+          </w:tcPr>
+          <w:p>
+            <w:r>
+              <w:t xml:space="preserve">UoM </w:t>
+            </w:r>
+            <w:r>
+              <w:rPr>
+                <w:rFonts w:ascii="Consolas" w:hAnsi="Consolas"/>
+                <w:sz w:val="19"/>
+              </w:rPr>
+              <w:t>factor</w:t>
+            </w:r>
+            <w:r>
+              <w:t xml:space="preserve"> / </w:t>
+            </w:r>
+            <w:r>
+              <w:rPr>
+                <w:rFonts w:ascii="Consolas" w:hAnsi="Consolas"/>
+                <w:sz w:val="19"/>
+              </w:rPr>
+              <w:t>is_case</w:t>
+            </w:r>
+          </w:p>
+        </w:tc>
+        <w:tc>
+          <w:tcPr>
+            <w:tcW w:type="dxa" w:w="4320"/>
+          </w:tcPr>
+          <w:p>
+            <w:r>
+              <w:rPr>
+                <w:b/>
+              </w:rPr>
+              <w:t>Guided form</w:t>
+            </w:r>
+            <w:r>
+              <w:t>: "1 Carton = ___ Units" with a live example</w:t>
+            </w:r>
+          </w:p>
+        </w:tc>
+      </w:tr>
+      <w:tr>
+        <w:tc>
+          <w:tcPr>
+            <w:tcW w:type="dxa" w:w="4320"/>
+          </w:tcPr>
+          <w:p>
+            <w:r>
+              <w:rPr>
+                <w:rFonts w:ascii="Consolas" w:hAnsi="Consolas"/>
+                <w:sz w:val="19"/>
+              </w:rPr>
+              <w:t>company_id</w:t>
+            </w:r>
+            <w:r>
+              <w:t xml:space="preserve"> isolation</w:t>
+            </w:r>
+          </w:p>
+        </w:tc>
+        <w:tc>
+          <w:tcPr>
+            <w:tcW w:type="dxa" w:w="4320"/>
+          </w:tcPr>
+          <w:p>
+            <w:r>
+              <w:t xml:space="preserve">Invisible — the admin only ever sees </w:t>
+            </w:r>
+            <w:r>
+              <w:rPr>
+                <w:b/>
+              </w:rPr>
+              <w:t>their</w:t>
+            </w:r>
+            <w:r>
+              <w:t xml:space="preserve"> company</w:t>
+            </w:r>
+          </w:p>
+        </w:tc>
+      </w:tr>
+    </w:tbl>
+    <w:p/>
+    <w:p>
+      <w:pPr>
+        <w:pStyle w:val="Heading3"/>
+      </w:pPr>
+      <w:r>
+        <w:t>Per-builder usability design</w:t>
+      </w:r>
+    </w:p>
+    <w:p>
+      <w:r>
+        <w:rPr>
+          <w:b/>
+        </w:rPr>
+        <w:t>Organization Builder</w:t>
+      </w:r>
+      <w:r>
+        <w:t xml:space="preserve"> — a </w:t>
+      </w:r>
+      <w:r>
+        <w:rPr>
+          <w:b/>
+        </w:rPr>
+        <w:t>drag-and-drop org chart</w:t>
+      </w:r>
+      <w:r>
+        <w:t>: add a box, name it, drag people</w:t>
+      </w:r>
+    </w:p>
+    <w:p>
+      <w:r>
+        <w:t>in, drag a box under another to set reporting, click a node to **assign a manager / assign</w:t>
+      </w:r>
+    </w:p>
+    <w:p>
+      <w:r>
+        <w:t>users</w:t>
+      </w:r>
+      <w:r>
+        <w:rPr>
+          <w:b/>
+        </w:rPr>
+        <w:t xml:space="preserve">, move whole teams visually. A side panel shows </w:t>
+      </w:r>
+      <w:r>
+        <w:t>"This manager will see: …"** in</w:t>
+      </w:r>
+    </w:p>
+    <w:p>
+      <w:r>
+        <w:t>plain words (the scoping preview) so the admin understands the effect without knowing RLS.</w:t>
+      </w:r>
+    </w:p>
+    <w:p>
+      <w:r>
+        <w:rPr>
+          <w:b/>
+        </w:rPr>
+        <w:t>Product Builder</w:t>
+      </w:r>
+      <w:r>
+        <w:t xml:space="preserve"> — </w:t>
+      </w:r>
+      <w:r>
+        <w:rPr>
+          <w:b/>
+        </w:rPr>
+        <w:t>add levels visually</w:t>
+      </w:r>
+      <w:r>
+        <w:t xml:space="preserve"> ("Category → Brand → SKU", rename inline),</w:t>
+      </w:r>
+    </w:p>
+    <w:p>
+      <w:r>
+        <w:rPr>
+          <w:b/>
+        </w:rPr>
+        <w:t>drag-and-drop</w:t>
+      </w:r>
+      <w:r>
+        <w:t xml:space="preserve"> products into the structure (search + bulk select), folder-style tree.</w:t>
+      </w:r>
+    </w:p>
+    <w:p>
+      <w:r>
+        <w:rPr>
+          <w:b/>
+        </w:rPr>
+        <w:t>UoM setup = guided forms</w:t>
+      </w:r>
+      <w:r>
+        <w:t>: pick the base unit, then "1 Pack = N Units", "1 Carton = N</w:t>
+      </w:r>
+    </w:p>
+    <w:p>
+      <w:r>
+        <w:t xml:space="preserve">Packs", with a </w:t>
+      </w:r>
+      <w:r>
+        <w:rPr>
+          <w:b/>
+        </w:rPr>
+        <w:t>live conversion preview</w:t>
+      </w:r>
+      <w:r>
+        <w:t xml:space="preserve"> and barcode field — no factors/maths exposed.</w:t>
+      </w:r>
+    </w:p>
+    <w:p>
+      <w:r>
+        <w:rPr>
+          <w:b/>
+        </w:rPr>
+        <w:t>Role Templates</w:t>
+      </w:r>
+      <w:r>
+        <w:t xml:space="preserve"> — </w:t>
+      </w:r>
+      <w:r>
+        <w:rPr>
+          <w:b/>
+        </w:rPr>
+        <w:t>permission groups with descriptions</w:t>
+      </w:r>
+      <w:r>
+        <w:t xml:space="preserve"> (grouped by job area, each a</w:t>
+      </w:r>
+    </w:p>
+    <w:p>
+      <w:r>
+        <w:t xml:space="preserve">clear sentence), simple on/off toggles, </w:t>
+      </w:r>
+      <w:r>
+        <w:rPr>
+          <w:b/>
+        </w:rPr>
+        <w:t>clone an existing template</w:t>
+      </w:r>
+      <w:r>
+        <w:t>, and **industry</w:t>
+      </w:r>
+    </w:p>
+    <w:p>
+      <w:r>
+        <w:t>presets</w:t>
+      </w:r>
+      <w:r>
+        <w:rPr>
+          <w:b/>
+        </w:rPr>
+        <w:t xml:space="preserve"> ("Start from FMCG roles"). A </w:t>
+      </w:r>
+      <w:r>
+        <w:t>"what this role can do"** summary in business</w:t>
+      </w:r>
+    </w:p>
+    <w:p>
+      <w:r>
+        <w:t>terms; no raw permission keys or matrices-of-codes.</w:t>
+      </w:r>
+    </w:p>
+    <w:p>
+      <w:pPr>
+        <w:pStyle w:val="Heading3"/>
+      </w:pPr>
+      <w:r>
+        <w:t>Cross-cutting UX principles</w:t>
+      </w:r>
+    </w:p>
+    <w:p>
+      <w:pPr>
+        <w:pStyle w:val="ListBullet"/>
+      </w:pPr>
+      <w:r>
+        <w:rPr>
+          <w:b/>
+        </w:rPr>
+        <w:t>Template-first / sensible defaults:</w:t>
+      </w:r>
+      <w:r>
+        <w:t xml:space="preserve"> picking an industry pre-fills org, products,</w:t>
+      </w:r>
+    </w:p>
+    <w:p>
+      <w:r>
+        <w:t xml:space="preserve">roles, and UoM — the admin </w:t>
+      </w:r>
+      <w:r>
+        <w:rPr>
+          <w:b/>
+        </w:rPr>
+        <w:t>edits</w:t>
+      </w:r>
+      <w:r>
+        <w:t>, rarely builds from scratch.</w:t>
+      </w:r>
+    </w:p>
+    <w:p>
+      <w:pPr>
+        <w:pStyle w:val="ListBullet"/>
+      </w:pPr>
+      <w:r>
+        <w:rPr>
+          <w:b/>
+        </w:rPr>
+        <w:t>Progressive disclosure:</w:t>
+      </w:r>
+      <w:r>
+        <w:t xml:space="preserve"> show the simple path first; advanced options tucked behind</w:t>
+      </w:r>
+    </w:p>
+    <w:p>
+      <w:r>
+        <w:t>"More". A 3-level company never sees 6-level complexity.</w:t>
+      </w:r>
+    </w:p>
+    <w:p>
+      <w:pPr>
+        <w:pStyle w:val="ListBullet"/>
+      </w:pPr>
+      <w:r>
+        <w:rPr>
+          <w:b/>
+        </w:rPr>
+        <w:t>Inline guidance &amp; examples</w:t>
+      </w:r>
+      <w:r>
+        <w:t xml:space="preserve"> on every step (a one-line "what this means" + a sample),</w:t>
+      </w:r>
+    </w:p>
+    <w:p>
+      <w:r>
+        <w:t xml:space="preserve">so </w:t>
+      </w:r>
+      <w:r>
+        <w:rPr>
+          <w:b/>
+        </w:rPr>
+        <w:t>no external docs</w:t>
+      </w:r>
+      <w:r>
+        <w:t xml:space="preserve"> are needed.</w:t>
+      </w:r>
+    </w:p>
+    <w:p>
+      <w:pPr>
+        <w:pStyle w:val="ListBullet"/>
+      </w:pPr>
+      <w:r>
+        <w:rPr>
+          <w:b/>
+        </w:rPr>
+        <w:t>Visual-first:</w:t>
+      </w:r>
+      <w:r>
+        <w:t xml:space="preserve"> org/reporting/product are </w:t>
+      </w:r>
+      <w:r>
+        <w:rPr>
+          <w:b/>
+        </w:rPr>
+        <w:t>diagrams you manipulate</w:t>
+      </w:r>
+      <w:r>
+        <w:t>, not forms of IDs.</w:t>
+      </w:r>
+    </w:p>
+    <w:p>
+      <w:pPr>
+        <w:pStyle w:val="ListBullet"/>
+      </w:pPr>
+      <w:r>
+        <w:rPr>
+          <w:b/>
+        </w:rPr>
+        <w:t>Forgiving:</w:t>
+      </w:r>
+      <w:r>
+        <w:t xml:space="preserve"> autosave + resume, </w:t>
+      </w:r>
+      <w:r>
+        <w:rPr>
+          <w:b/>
+        </w:rPr>
+        <w:t>undo</w:t>
+      </w:r>
+      <w:r>
+        <w:t>, non-destructive edits, friendly empty states</w:t>
+      </w:r>
+    </w:p>
+    <w:p>
+      <w:r>
+        <w:t xml:space="preserve">("Add your first branch"), and </w:t>
+      </w:r>
+      <w:r>
+        <w:rPr>
+          <w:b/>
+        </w:rPr>
+        <w:t>plain-language validation</w:t>
+      </w:r>
+      <w:r>
+        <w:t xml:space="preserve"> ("Every person needs a</w:t>
+      </w:r>
+    </w:p>
+    <w:p>
+      <w:r>
+        <w:t>manager — 2 people still need one").</w:t>
+      </w:r>
+    </w:p>
+    <w:p>
+      <w:pPr>
+        <w:pStyle w:val="ListBullet"/>
+      </w:pPr>
+      <w:r>
+        <w:rPr>
+          <w:b/>
+        </w:rPr>
+        <w:t>Confirm in business terms:</w:t>
+      </w:r>
+      <w:r>
+        <w:t xml:space="preserve"> Go-Live checklist reads "✓ Org chart set · ✓ Roles ready ·</w:t>
+      </w:r>
+    </w:p>
+    <w:p>
+      <w:r>
+        <w:t>✓ Products &amp; units · ✓ Users invited" — not technical gates.</w:t>
+      </w:r>
+    </w:p>
+    <w:p>
+      <w:pPr>
+        <w:pStyle w:val="ListBullet"/>
+      </w:pPr>
+      <w:r>
+        <w:rPr>
+          <w:b/>
+        </w:rPr>
+        <w:t>Responsive / mobile-friendly</w:t>
+      </w:r>
+      <w:r>
+        <w:t xml:space="preserve"> so setup works on a tablet.</w:t>
+      </w:r>
+    </w:p>
+    <w:p>
+      <w:pPr>
+        <w:pStyle w:val="Heading3"/>
+      </w:pPr>
+      <w:r>
+        <w:t>Never shown to a Company Admin</w:t>
+      </w:r>
+    </w:p>
+    <w:p>
+      <w:r>
+        <w:t xml:space="preserve">RLS/policies · </w:t>
+      </w:r>
+      <w:r>
+        <w:rPr>
+          <w:rFonts w:ascii="Consolas" w:hAnsi="Consolas"/>
+          <w:sz w:val="19"/>
+        </w:rPr>
+        <w:t>reports_to</w:t>
+      </w:r>
+      <w:r>
+        <w:t xml:space="preserve">/table/column names · raw permission keys · SQL · </w:t>
+      </w:r>
+      <w:r>
+        <w:rPr>
+          <w:rFonts w:ascii="Consolas" w:hAnsi="Consolas"/>
+          <w:sz w:val="19"/>
+        </w:rPr>
+        <w:t>company_id</w:t>
+      </w:r>
+      <w:r>
+        <w:t xml:space="preserve"> ·</w:t>
+      </w:r>
+    </w:p>
+    <w:p>
+      <w:r>
+        <w:t xml:space="preserve">migration/DB concepts. These exist </w:t>
+      </w:r>
+      <w:r>
+        <w:rPr>
+          <w:b/>
+        </w:rPr>
+        <w:t>only</w:t>
+      </w:r>
+      <w:r>
+        <w:t xml:space="preserve"> in the engine layer.</w:t>
+      </w:r>
+    </w:p>
+    <w:p>
+      <w:pPr>
+        <w:pStyle w:val="Heading3"/>
+      </w:pPr>
+      <w:r>
+        <w:t>Success criteria (usability acceptance)</w:t>
+      </w:r>
+    </w:p>
+    <w:p>
+      <w:pPr>
+        <w:pStyle w:val="ListBullet"/>
+      </w:pPr>
+      <w:r>
+        <w:t xml:space="preserve">A first-time, non-technical admin completes onboarding </w:t>
+      </w:r>
+      <w:r>
+        <w:rPr>
+          <w:b/>
+        </w:rPr>
+        <w:t>unaided</w:t>
+      </w:r>
+      <w:r>
+        <w:t xml:space="preserve"> (no docs/SQL/dev).</w:t>
+      </w:r>
+    </w:p>
+    <w:p>
+      <w:pPr>
+        <w:pStyle w:val="ListBullet"/>
+      </w:pPr>
+      <w:r>
+        <w:t xml:space="preserve">Setting "who reports to whom" and "who sees what" is done </w:t>
+      </w:r>
+      <w:r>
+        <w:rPr>
+          <w:b/>
+        </w:rPr>
+        <w:t>visually</w:t>
+      </w:r>
+      <w:r>
+        <w:t>, with a correct</w:t>
+      </w:r>
+    </w:p>
+    <w:p>
+      <w:r>
+        <w:t>plain-language preview.</w:t>
+      </w:r>
+    </w:p>
+    <w:p>
+      <w:pPr>
+        <w:pStyle w:val="ListBullet"/>
+      </w:pPr>
+      <w:r>
+        <w:t xml:space="preserve">Renaming/adding a hierarchy level and adding a UoM each take </w:t>
+      </w:r>
+      <w:r>
+        <w:rPr>
+          <w:b/>
+        </w:rPr>
+        <w:t>seconds via guided UI</w:t>
+      </w:r>
+      <w:r>
+        <w:t>.</w:t>
+      </w:r>
+    </w:p>
+    <w:p>
+      <w:pPr>
+        <w:pStyle w:val="ListBullet"/>
+      </w:pPr>
+      <w:r>
+        <w:t>Zero exposure of database/security terminology anywhere in the Company-Admin surface.</w:t>
+      </w:r>
+    </w:p>
+    <w:p>
+      <w:pPr>
+        <w:pStyle w:val="Heading2"/>
+      </w:pPr>
+      <w:r>
+        <w:rPr>
+          <w:color w:val="1F497D"/>
+        </w:rPr>
         <w:t>Status</w:t>
       </w:r>
     </w:p>
@@ -3771,15 +4635,15 @@
         <w:rPr>
           <w:b/>
         </w:rPr>
-        <w:t xml:space="preserve"> by the </w:t>
-      </w:r>
-      <w:r>
-        <w:t>Company Admin**, within hard tenant-isolation guardrails, without code</w:t>
+        <w:t xml:space="preserve"> by a </w:t>
+      </w:r>
+      <w:r>
+        <w:t>non-technical Company Admin** — wizard-driven, visual, business-language</w:t>
       </w:r>
     </w:p>
     <w:p>
       <w:r>
-        <w:t>changes.</w:t>
+        <w:t>only — within hard tenant-isolation guardrails, and without code changes.</w:t>
       </w:r>
     </w:p>
     <w:sectPr>

</xml_diff>

<commit_message>
docs(arch): add explicit Core UX principle (business-friendly, non-technical, wizard-driven, safe by default)
Promotes the usability requirement to a prominent overriding principle near the top:
Company Admin must never need RLS/tables/reports_to/permission-matrix internals; all setup
wizard-driven, visual, guided, safe by default; violating screens are defects.

Co-Authored-By: Claude Opus 4.8 (1M context) <noreply@anthropic.com>
Claude-Session: https://claude.ai/code/session_01AnB42F2fTvBjmAfvzDNk4V
</commit_message>
<xml_diff>
--- a/docs/audits/Company-Onboarding-Hierarchy-Platform-Design-2026.docx
+++ b/docs/audits/Company-Onboarding-Hierarchy-Platform-Design-2026.docx
@@ -102,6 +102,136 @@
     <w:p>
       <w:r>
         <w:t>existing platform infrastructure.</w:t>
+      </w:r>
+    </w:p>
+    <w:p>
+      <w:pPr>
+        <w:ind w:left="360"/>
+      </w:pPr>
+      <w:r>
+        <w:rPr>
+          <w:i/>
+        </w:rPr>
+      </w:r>
+      <w:r>
+        <w:rPr>
+          <w:i/>
+        </w:rPr>
+        <w:t>## Core UX principle (overrides all design decisions)</w:t>
+      </w:r>
+    </w:p>
+    <w:p>
+      <w:pPr>
+        <w:ind w:left="360"/>
+      </w:pPr>
+      <w:r>
+        <w:rPr>
+          <w:i/>
+        </w:rPr>
+      </w:r>
+      <w:r>
+        <w:rPr>
+          <w:b/>
+          <w:i/>
+        </w:rPr>
+        <w:t>The Company Admin experience must be business-friendly and non-technical.</w:t>
+      </w:r>
+      <w:r>
+        <w:rPr>
+          <w:i/>
+        </w:rPr>
+        <w:t xml:space="preserve"> A Company</w:t>
+      </w:r>
+    </w:p>
+    <w:p>
+      <w:pPr>
+        <w:ind w:left="360"/>
+      </w:pPr>
+      <w:r>
+        <w:rPr>
+          <w:i/>
+        </w:rPr>
+      </w:r>
+      <w:r>
+        <w:rPr>
+          <w:i/>
+        </w:rPr>
+        <w:t xml:space="preserve">Admin should </w:t>
+      </w:r>
+      <w:r>
+        <w:rPr>
+          <w:b/>
+          <w:i/>
+        </w:rPr>
+        <w:t>never</w:t>
+      </w:r>
+      <w:r>
+        <w:rPr>
+          <w:i/>
+        </w:rPr>
+        <w:t xml:space="preserve"> need to understand RLS, database tables, </w:t>
+      </w:r>
+      <w:r>
+        <w:rPr>
+          <w:rFonts w:ascii="Consolas" w:hAnsi="Consolas"/>
+          <w:i/>
+          <w:sz w:val="19"/>
+        </w:rPr>
+        <w:t>reports_to</w:t>
+      </w:r>
+      <w:r>
+        <w:rPr>
+          <w:i/>
+        </w:rPr>
+        <w:t xml:space="preserve"> internals,</w:t>
+      </w:r>
+    </w:p>
+    <w:p>
+      <w:pPr>
+        <w:ind w:left="360"/>
+      </w:pPr>
+      <w:r>
+        <w:rPr>
+          <w:i/>
+        </w:rPr>
+      </w:r>
+      <w:r>
+        <w:rPr>
+          <w:i/>
+        </w:rPr>
+        <w:t>or permission-matrix internals. **All setup must be wizard-driven, visual, guided, and</w:t>
+      </w:r>
+    </w:p>
+    <w:p>
+      <w:pPr>
+        <w:ind w:left="360"/>
+      </w:pPr>
+      <w:r>
+        <w:rPr>
+          <w:i/>
+        </w:rPr>
+      </w:r>
+      <w:r>
+        <w:rPr>
+          <w:i/>
+        </w:rPr>
+        <w:t>safe by default.** Any screen that violates this principle is a defect, regardless of</w:t>
+      </w:r>
+    </w:p>
+    <w:p>
+      <w:pPr>
+        <w:ind w:left="360"/>
+      </w:pPr>
+      <w:r>
+        <w:rPr>
+          <w:i/>
+        </w:rPr>
+      </w:r>
+      <w:r>
+        <w:rPr>
+          <w:i/>
+        </w:rPr>
+        <w:t>functional correctness.</w:t>
       </w:r>
     </w:p>
     <w:p>

</xml_diff>